<commit_message>
docs: test plan v1.10 - J11 ticked Pass, Section J sign-off ticked
Co-Authored-By: Claude Sonnet 5.5 <noreply@anthropic.com>
</commit_message>
<xml_diff>
--- a/docs/Item_Difficulty_Test_Plan_v1.10.docx
+++ b/docs/Item_Difficulty_Test_Plan_v1.10.docx
@@ -198,7 +198,7 @@
               <w:rPr>
                 <w:sz w:val="17"/>
               </w:rPr>
-              <w:t>J1 to J10 = Pass (ticked below, with notes). J11 and Sections A to I have not been run yet. This file is the working copy: tick the remaining results here.</w:t>
+              <w:t>J1 to J11 = Pass (ticked below, with notes), so Section J is complete. Sections A to I have not been run yet. This file is the working copy: tick the remaining results here.</w:t>
             </w:r>
           </w:p>
         </w:tc>
@@ -16630,12 +16630,16 @@
             <w:pPr>
               <w:spacing w:after="40"/>
             </w:pPr>
-            <w:r/>
-            <w:r>
-              <w:rPr>
-                <w:sz w:val="17"/>
-              </w:rPr>
-              <w:t>☐ Pass</w:t>
+            <w:r>
+              <w:rPr>
+                <w:sz w:val="17"/>
+              </w:rPr>
+              <w:t>☒ Pass</w:t>
+            </w:r>
+            <w:r>
+              <w:rPr>
+                <w:sz w:val="17"/>
+              </w:rPr>
             </w:r>
           </w:p>
           <w:p>
@@ -16685,6 +16689,12 @@
               <w:rPr>
                 <w:sz w:val="17"/>
               </w:rPr>
+            </w:r>
+            <w:r>
+              <w:rPr>
+                <w:sz w:val="17"/>
+              </w:rPr>
+              <w:t>Pass (tester-reported): hover values matched Figure1_values_v5.csv for Modules 1 to 6 with the Cohort filter on BuffaloPrep + amherstyouthandrec2D.</w:t>
             </w:r>
           </w:p>
         </w:tc>
@@ -20020,7 +20030,7 @@
               <w:rPr>
                 <w:sz w:val="17"/>
               </w:rPr>
-              <w:t>☐ yes  ☐ no</w:t>
+              <w:t>☒ yes  ☐ no</w:t>
             </w:r>
           </w:p>
         </w:tc>

</xml_diff>